<commit_message>
Add a module dependency diagram to README.md and the architecture doc
README gets a Mermaid flowchart (rendered natively by GitHub) under its
modules table, which was also stale - it said five modules and was
missing :common and both feature modules. The architecture docx gets
the same graph as an embedded PNG, labelled in the doc's own no-code-
names vocabulary; its Mermaid source is committed as
docs/architecture-diagram.mmd so the image can be regenerated rather
than redrawn. Both include the planned :database module alongside
:network under :data, with the README noting it isn't created yet.

Co-Authored-By: Claude Opus 5.5 <noreply@anthropic.com>
Claude-Session: https://claude.ai/code/session_01P6YNUgzhj2tUoaKap3onSf
</commit_message>
<xml_diff>
--- a/docs/architecture.docx
+++ b/docs/architecture.docx
@@ -798,7 +798,53 @@
           <w:sz w:val="22"/>
           <w:szCs w:val="22"/>
         </w:rPr>
-        <w:t xml:space="preserve">Dependencies only ever point one way — a module never depends on something built on top of it.</w:t>
+        <w:t xml:space="preserve">Dependencies only ever point one way — a module never depends on something built on top of it. Each arrow points from a module to what it depends on; grey boxes are the external libraries each boundary protects, each reachable from exactly one module.</w:t>
+      </w:r>
+    </w:p>
+    <w:p>
+      <w:pPr>
+        <w:spacing w:after="200" w:before="120"/>
+        <w:jc w:val="center"/>
+      </w:pPr>
+      <w:r>
+        <w:drawing>
+          <wp:inline distT="0" distB="0" distL="0" distR="0">
+            <wp:extent cx="5715000" cy="5314950"/>
+            <wp:effectExtent t="0" r="0" b="0" l="0"/>
+            <wp:docPr id="1" name="dependency-diagram" descr="Arrows from each module to the modules and external libraries it depends on." title="Module dependency diagram"/>
+            <wp:cNvGraphicFramePr>
+              <a:graphicFrameLocks xmlns:a="http://schemas.openxmlformats.org/drawingml/2006/main" noChangeAspect="1"/>
+            </wp:cNvGraphicFramePr>
+            <a:graphic xmlns:a="http://schemas.openxmlformats.org/drawingml/2006/main">
+              <a:graphicData uri="http://schemas.openxmlformats.org/drawingml/2006/picture">
+                <pic:pic xmlns:pic="http://schemas.openxmlformats.org/drawingml/2006/picture">
+                  <pic:nvPicPr>
+                    <pic:cNvPr id="0" name="" descr=""/>
+                    <pic:cNvPicPr>
+                      <a:picLocks noChangeAspect="1" noChangeArrowheads="1"/>
+                    </pic:cNvPicPr>
+                  </pic:nvPicPr>
+                  <pic:blipFill>
+                    <a:blip r:embed="rId7" cstate="none"/>
+                    <a:srcRect/>
+                    <a:stretch>
+                      <a:fillRect/>
+                    </a:stretch>
+                  </pic:blipFill>
+                  <pic:spPr bwMode="auto">
+                    <a:xfrm>
+                      <a:off x="0" y="0"/>
+                      <a:ext cx="5715000" cy="5314950"/>
+                    </a:xfrm>
+                    <a:prstGeom prst="rect">
+                      <a:avLst/>
+                    </a:prstGeom>
+                  </pic:spPr>
+                </pic:pic>
+              </a:graphicData>
+            </a:graphic>
+          </wp:inline>
+        </w:drawing>
       </w:r>
     </w:p>
     <w:tbl>

</xml_diff>

<commit_message>
Merge safeAppCall into a single public safeApiCall
safeApiCall now catches the exceptions and maps them straight to
AppError, replacing the internal safeApiCall -> NetworkResult/NetworkError
-> safeAppCall -> AppResult two-step. Every exception maps to the same
AppError as before; the unused raw error body read for HttpException is
dropped. NetworkResult.kt, NetworkError.kt and SafeAppCall.kt are deleted,
the four repository implementations call safeApiCall, and comments, docs
and docs/architecture.docx are updated.

Co-Authored-By: Claude Opus 5.5 <noreply@anthropic.com>
Claude-Session: https://claude.ai/code/session_01LjX3sToQo6yGYAPVEqh5cw
</commit_message>
<xml_diff>
--- a/docs/architecture.docx
+++ b/docs/architecture.docx
@@ -1131,7 +1131,7 @@
                 <w:sz w:val="18"/>
                 <w:szCs w:val="18"/>
               </w:rPr>
-              <w:t xml:space="preserve">safeAppCall</w:t>
+              <w:t xml:space="preserve">safeApiCall</w:t>
             </w:r>
           </w:p>
         </w:tc>
@@ -4749,7 +4749,7 @@
           <w:sz w:val="19"/>
           <w:szCs w:val="19"/>
         </w:rPr>
-        <w:t xml:space="preserve">safeAppCall</w:t>
+        <w:t xml:space="preserve">safeApiCall</w:t>
       </w:r>
       <w:r>
         <w:t xml:space="preserve">, which maps every exception to an </w:t>
@@ -8100,7 +8100,7 @@
           <w:sz w:val="15"/>
           <w:szCs w:val="15"/>
         </w:rPr>
-        <w:t xml:space="preserve">        safeAppCall { api.getLeads(status, search, pageNo).data }.map { it.toDomain() }</w:t>
+        <w:t xml:space="preserve">        safeApiCall { api.getLeads(status, search, pageNo).data }.map { it.toDomain() }</w:t>
       </w:r>
     </w:p>
     <w:p>

</xml_diff>